<commit_message>
paper: sync poc/paper DOCX with clean build; remove workaround figure PNG
</commit_message>
<xml_diff>
--- a/poc/paper/paper_mdpi.docx
+++ b/poc/paper/paper_mdpi.docx
@@ -10690,20 +10690,20 @@
       <w:r>
         <w:drawing>
           <wp:inline>
-            <wp:extent cx="4989830" cy="2079095"/>
+            <wp:extent cx="4989830" cy="2080135"/>
             <wp:effectExtent b="0" l="0" r="0" t="0"/>
-            <wp:docPr descr="Difficult-subset AUROC by method" title="" id="32" name="Picture"/>
+            <wp:docPr descr="figure" title="" id="32" name="Picture"/>
             <a:graphic>
               <a:graphicData uri="http://schemas.openxmlformats.org/drawingml/2006/picture">
                 <pic:pic>
                   <pic:nvPicPr>
-                    <pic:cNvPr descr="figures/fig1.png" id="33" name="Picture"/>
+                    <pic:cNvPr descr="_inlinesvg_0.png" id="33" name="Picture"/>
                     <pic:cNvPicPr>
                       <a:picLocks noChangeArrowheads="1" noChangeAspect="1"/>
                     </pic:cNvPicPr>
                   </pic:nvPicPr>
                   <pic:blipFill>
-                    <a:blip r:embed="rId46"/>
+                    <a:blip r:embed="rId51"/>
                     <a:stretch>
                       <a:fillRect/>
                     </a:stretch>
@@ -10711,7 +10711,7 @@
                   <pic:spPr bwMode="auto">
                     <a:xfrm>
                       <a:off x="0" y="0"/>
-                      <a:ext cx="4989830" cy="2079095"/>
+                      <a:ext cx="4989830" cy="2080135"/>
                     </a:xfrm>
                     <a:prstGeom prst="rect">
                       <a:avLst/>

</xml_diff>